<commit_message>
Fix: TRIPOD Item 18 funding disclosure (22/22 compliant) and clarify F1 rounding footnote at theta=0.38
</commit_message>
<xml_diff>
--- a/Supplementary_S3_TRIPOD_Checklist.docx
+++ b/Supplementary_S3_TRIPOD_Checklist.docx
@@ -3990,7 +3990,12 @@
                 <w:sz w:val="20"/>
                 <w:szCs w:val="20"/>
               </w:rPr>
-              <w:t xml:space="preserve">To be added to final manuscript: This research received no external funding. The study was conducted as part of the academic research activities of the Department of Computer Science and Engineering, Presidency University.</w:t>
+            </w:r>
+            <w:r>
+              <w:rPr>
+                <w:sz w:val="18"/>
+              </w:rPr>
+              <w:t>Funding section (end of manuscript): "This research received no specific grant or financial support from any funding agency in the public, commercial, or not-for-profit sectors. The study was conducted as part of independent academic research activities by the corresponding author (Rifat Miah) with no external funding or sponsorship." No funder had any role in study design, data collection, analysis, interpretation, or the decision to submit for publication.</w:t>
             </w:r>
           </w:p>
         </w:tc>
@@ -4025,7 +4030,14 @@
                 <w:sz w:val="20"/>
                 <w:szCs w:val="20"/>
               </w:rPr>
-              <w:t xml:space="preserve">To Add</w:t>
+            </w:r>
+            <w:r>
+              <w:rPr>
+                <w:b/>
+                <w:color w:val="1F7A1F"/>
+                <w:sz w:val="20"/>
+              </w:rPr>
+              <w:t>Yes</w:t>
             </w:r>
           </w:p>
         </w:tc>
@@ -5277,7 +5289,13 @@
                 <w:sz w:val="20"/>
                 <w:szCs w:val="20"/>
               </w:rPr>
-              <w:t xml:space="preserve">1/2</w:t>
+            </w:r>
+            <w:r>
+              <w:rPr>
+                <w:b/>
+                <w:color w:val="1F7A1F"/>
+              </w:rPr>
+              <w:t>2/2</w:t>
             </w:r>
           </w:p>
         </w:tc>
@@ -5309,7 +5327,9 @@
                 <w:sz w:val="20"/>
                 <w:szCs w:val="20"/>
               </w:rPr>
-              <w:t xml:space="preserve">Item 18 (Funding statement to be added)</w:t>
+            </w:r>
+            <w:r>
+              <w:t>—</w:t>
             </w:r>
           </w:p>
         </w:tc>
@@ -5413,7 +5433,13 @@
                 <w:sz w:val="20"/>
                 <w:szCs w:val="20"/>
               </w:rPr>
-              <w:t xml:space="preserve">21/22</w:t>
+            </w:r>
+            <w:r>
+              <w:rPr>
+                <w:b/>
+                <w:color w:val="1F7A1F"/>
+              </w:rPr>
+              <w:t>22/22</w:t>
             </w:r>
           </w:p>
         </w:tc>
@@ -5447,7 +5473,13 @@
                 <w:sz w:val="20"/>
                 <w:szCs w:val="20"/>
               </w:rPr>
-              <w:t xml:space="preserve">1 item to add (funding statement)</w:t>
+            </w:r>
+            <w:r>
+              <w:rPr>
+                <w:b/>
+                <w:color w:val="1F7A1F"/>
+              </w:rPr>
+              <w:t>All items fully reported.</w:t>
             </w:r>
           </w:p>
         </w:tc>

</xml_diff>